<commit_message>
fix template add regen template only
</commit_message>
<xml_diff>
--- a/template/ใบรับรองแทนใบเสร็จรับเงิน.docx
+++ b/template/ใบรับรองแทนใบเสร็จรับเงิน.docx
@@ -23,11 +23,11 @@
       </w:pPr>
       <w:proofErr w:type="spellStart"/>
       <w:r>
-        <w:t>ผู้</w:t>
-      </w:r>
-      <w:proofErr w:type="spellEnd"/>
-      <w:r>
-        <w:t>ซื้อ/</w:t>
+        <w:t>ผู้ซื้อ</w:t>
+      </w:r>
+      <w:proofErr w:type="spellEnd"/>
+      <w:r>
+        <w:t>/</w:t>
       </w:r>
       <w:proofErr w:type="spellStart"/>
       <w:r>
@@ -61,10 +61,7 @@
       </w:r>
       <w:proofErr w:type="spellEnd"/>
       <w:r>
-        <w:t xml:space="preserve">: </w:t>
-      </w:r>
-      <w:r>
-        <w:t xml:space="preserve">43/9 </w:t>
+        <w:t xml:space="preserve">: 43/9 </w:t>
       </w:r>
       <w:proofErr w:type="spellStart"/>
       <w:r>
@@ -109,10 +106,7 @@
       </w:r>
       <w:proofErr w:type="spellEnd"/>
       <w:r>
-        <w:t xml:space="preserve">: </w:t>
-      </w:r>
-      <w:r>
-        <w:t>1103702117561</w:t>
+        <w:t>: 1103702117561</w:t>
       </w:r>
     </w:p>
     <w:p>
@@ -125,13 +119,8 @@
       </w:r>
       <w:proofErr w:type="spellEnd"/>
       <w:r>
-        <w:t xml:space="preserve">: </w:t>
-      </w:r>
-      <w:r>
-        <w:t>0984328866</w:t>
-      </w:r>
-      <w:bookmarkStart w:id="0" w:name="_GoBack"/>
-      <w:bookmarkEnd w:id="0"/>
+        <w:t>: 0984328866</w:t>
+      </w:r>
     </w:p>
     <w:p>
       <w:pPr>
@@ -180,18 +169,13 @@
         <w:gridCol w:w="2076"/>
       </w:tblGrid>
       <w:tr>
-        <w:tblPrEx>
-          <w:tblCellMar>
-            <w:top w:w="0" w:type="dxa"/>
-            <w:bottom w:w="0" w:type="dxa"/>
-          </w:tblCellMar>
-        </w:tblPrEx>
         <w:trPr>
+          <w:trHeight w:val="110"/>
           <w:tblHeader/>
         </w:trPr>
         <w:tc>
           <w:tcPr>
-            <w:tcW w:w="700" w:type="dxa"/>
+            <w:tcW w:w="809" w:type="dxa"/>
             <w:tcBorders>
               <w:top w:val="single" w:sz="4" w:space="0" w:color="000000"/>
               <w:left w:val="single" w:sz="4" w:space="0" w:color="000000"/>
@@ -220,7 +204,7 @@
         </w:tc>
         <w:tc>
           <w:tcPr>
-            <w:tcW w:w="4560" w:type="dxa"/>
+            <w:tcW w:w="4489" w:type="dxa"/>
             <w:tcBorders>
               <w:top w:val="single" w:sz="4" w:space="0" w:color="000000"/>
               <w:left w:val="single" w:sz="4" w:space="0" w:color="000000"/>
@@ -249,7 +233,7 @@
         </w:tc>
         <w:tc>
           <w:tcPr>
-            <w:tcW w:w="2000" w:type="dxa"/>
+            <w:tcW w:w="1986" w:type="dxa"/>
             <w:tcBorders>
               <w:top w:val="single" w:sz="4" w:space="0" w:color="000000"/>
               <w:left w:val="single" w:sz="4" w:space="0" w:color="000000"/>
@@ -289,7 +273,7 @@
         </w:tc>
         <w:tc>
           <w:tcPr>
-            <w:tcW w:w="2100" w:type="dxa"/>
+            <w:tcW w:w="2076" w:type="dxa"/>
             <w:tcBorders>
               <w:top w:val="single" w:sz="4" w:space="0" w:color="000000"/>
               <w:left w:val="single" w:sz="4" w:space="0" w:color="000000"/>
@@ -318,15 +302,12 @@
         </w:tc>
       </w:tr>
       <w:tr>
-        <w:tblPrEx>
-          <w:tblCellMar>
-            <w:top w:w="0" w:type="dxa"/>
-            <w:bottom w:w="0" w:type="dxa"/>
-          </w:tblCellMar>
-        </w:tblPrEx>
+        <w:trPr>
+          <w:trHeight w:val="25"/>
+        </w:trPr>
         <w:tc>
           <w:tcPr>
-            <w:tcW w:w="700" w:type="dxa"/>
+            <w:tcW w:w="809" w:type="dxa"/>
             <w:tcBorders>
               <w:top w:val="single" w:sz="4" w:space="0" w:color="000000"/>
               <w:left w:val="single" w:sz="4" w:space="0" w:color="000000"/>
@@ -360,7 +341,7 @@
         </w:tc>
         <w:tc>
           <w:tcPr>
-            <w:tcW w:w="4560" w:type="dxa"/>
+            <w:tcW w:w="4489" w:type="dxa"/>
             <w:tcBorders>
               <w:top w:val="single" w:sz="4" w:space="0" w:color="000000"/>
               <w:left w:val="single" w:sz="4" w:space="0" w:color="000000"/>
@@ -390,7 +371,7 @@
         </w:tc>
         <w:tc>
           <w:tcPr>
-            <w:tcW w:w="2000" w:type="dxa"/>
+            <w:tcW w:w="1986" w:type="dxa"/>
             <w:tcBorders>
               <w:top w:val="single" w:sz="4" w:space="0" w:color="000000"/>
               <w:left w:val="single" w:sz="4" w:space="0" w:color="000000"/>
@@ -423,7 +404,7 @@
         </w:tc>
         <w:tc>
           <w:tcPr>
-            <w:tcW w:w="2100" w:type="dxa"/>
+            <w:tcW w:w="2076" w:type="dxa"/>
             <w:tcBorders>
               <w:top w:val="single" w:sz="4" w:space="0" w:color="000000"/>
               <w:left w:val="single" w:sz="4" w:space="0" w:color="000000"/>
@@ -442,15 +423,12 @@
         </w:tc>
       </w:tr>
       <w:tr>
-        <w:tblPrEx>
-          <w:tblCellMar>
-            <w:top w:w="0" w:type="dxa"/>
-            <w:bottom w:w="0" w:type="dxa"/>
-          </w:tblCellMar>
-        </w:tblPrEx>
+        <w:trPr>
+          <w:trHeight w:val="182"/>
+        </w:trPr>
         <w:tc>
           <w:tcPr>
-            <w:tcW w:w="5260" w:type="dxa"/>
+            <w:tcW w:w="5298" w:type="dxa"/>
             <w:gridSpan w:val="2"/>
             <w:tcBorders>
               <w:top w:val="single" w:sz="4" w:space="0" w:color="000000"/>
@@ -479,7 +457,7 @@
         </w:tc>
         <w:tc>
           <w:tcPr>
-            <w:tcW w:w="2000" w:type="dxa"/>
+            <w:tcW w:w="1986" w:type="dxa"/>
             <w:tcBorders>
               <w:top w:val="single" w:sz="4" w:space="0" w:color="000000"/>
               <w:left w:val="single" w:sz="4" w:space="0" w:color="000000"/>
@@ -510,7 +488,7 @@
         </w:tc>
         <w:tc>
           <w:tcPr>
-            <w:tcW w:w="2100" w:type="dxa"/>
+            <w:tcW w:w="2076" w:type="dxa"/>
             <w:tcBorders>
               <w:top w:val="single" w:sz="4" w:space="0" w:color="000000"/>
               <w:left w:val="single" w:sz="4" w:space="0" w:color="000000"/>
@@ -602,6 +580,8 @@
       <w:r>
         <w:t>)</w:t>
       </w:r>
+      <w:bookmarkStart w:id="0" w:name="_GoBack"/>
+      <w:bookmarkEnd w:id="0"/>
     </w:p>
     <w:p>
       <w:pPr>
@@ -674,13 +654,11 @@
         <w:t>toDate</w:t>
       </w:r>
       <w:proofErr w:type="spellEnd"/>
-    </w:p>
-    <w:p>
-      <w:pPr>
-        <w:spacing w:before="700"/>
-      </w:pPr>
       <w:r>
         <w:tab/>
+      </w:r>
+      <w:r>
+        <w:br/>
       </w:r>
       <w:r>
         <w:tab/>
@@ -715,12 +693,6 @@
         <w:gridCol w:w="4680"/>
       </w:tblGrid>
       <w:tr>
-        <w:tblPrEx>
-          <w:tblCellMar>
-            <w:top w:w="0" w:type="dxa"/>
-            <w:bottom w:w="0" w:type="dxa"/>
-          </w:tblCellMar>
-        </w:tblPrEx>
         <w:tc>
           <w:tcPr>
             <w:tcW w:w="4680" w:type="dxa"/>
@@ -840,7 +812,7 @@
     <w:p/>
     <w:sectPr>
       <w:pgSz w:w="12240" w:h="15840"/>
-      <w:pgMar w:top="1440" w:right="1440" w:bottom="1440" w:left="1440" w:header="708" w:footer="708" w:gutter="0"/>
+      <w:pgMar w:top="990" w:right="1440" w:bottom="990" w:left="1440" w:header="708" w:footer="708" w:gutter="0"/>
       <w:cols w:space="720"/>
       <w:docGrid w:linePitch="360"/>
     </w:sectPr>

</xml_diff>